<commit_message>
fix: clarify amicable departure from Notamify
</commit_message>
<xml_diff>
--- a/public/michal_pasierbski_cv.docx
+++ b/public/michal_pasierbski_cv.docx
@@ -41,7 +41,7 @@
         <w:spacing w:after="25"/>
         <w:jc w:val="center"/>
       </w:pPr>
-      <w:hyperlink w:history="1" r:id="rIdzccl8amc4asnpeejeeoyp">
+      <w:hyperlink w:history="1" r:id="rId94qmuykm-nnvn8aii0uid">
         <w:r>
           <w:rPr>
             <w:rStyle w:val="Hyperlink"/>
@@ -52,7 +52,7 @@
       <w:r>
         <w:t xml:space="preserve"> | </w:t>
       </w:r>
-      <w:hyperlink w:history="1" r:id="rId0vp_wak3rnijv5gjgzdbk">
+      <w:hyperlink w:history="1" r:id="rIdliglgwrzgcuhjsce6dl-j">
         <w:r>
           <w:rPr>
             <w:rStyle w:val="Hyperlink"/>
@@ -63,7 +63,7 @@
       <w:r>
         <w:t xml:space="preserve"> | </w:t>
       </w:r>
-      <w:hyperlink w:history="1" r:id="rId_nvahqnzcfsfaf12dvhmq">
+      <w:hyperlink w:history="1" r:id="rIdtvcorrchrkzi8uud15sxt">
         <w:r>
           <w:rPr>
             <w:rStyle w:val="Hyperlink"/>
@@ -74,7 +74,7 @@
       <w:r>
         <w:t xml:space="preserve"> | </w:t>
       </w:r>
-      <w:hyperlink w:history="1" r:id="rId4hbib7wwc4ktu6ukwronr">
+      <w:hyperlink w:history="1" r:id="rIdc7qok5yhspthunxzyno5e">
         <w:r>
           <w:rPr>
             <w:rStyle w:val="Hyperlink"/>
@@ -1075,7 +1075,7 @@
         <w:keepNext/>
         <w:spacing w:after="70"/>
       </w:pPr>
-      <w:hyperlink w:history="1" r:id="rId31vp48s2u1iayylgghuei">
+      <w:hyperlink w:history="1" r:id="rIdptgujjn63jswvvfqask4l">
         <w:r>
           <w:rPr>
             <w:rStyle w:val="Hyperlink"/>
@@ -1168,7 +1168,7 @@
         <w:spacing w:after="25"/>
       </w:pPr>
       <w:r>
-        <w:t xml:space="preserve">2023 – 2024 (Exited)</w:t>
+        <w:t xml:space="preserve">2023 – 2024 (Stepped down)</w:t>
       </w:r>
     </w:p>
     <w:p>
@@ -1176,7 +1176,7 @@
         <w:keepNext/>
         <w:spacing w:after="70"/>
       </w:pPr>
-      <w:hyperlink w:history="1" r:id="rIds8ikt6gjsan_dt5p6vr31">
+      <w:hyperlink w:history="1" r:id="rIdhf99s_3tbue-xes_-odzq">
         <w:r>
           <w:rPr>
             <w:rStyle w:val="Hyperlink"/>
@@ -1219,10 +1219,10 @@
           <w:b/>
           <w:bCs/>
         </w:rPr>
-        <w:t xml:space="preserve">Architecture &amp; Exit:</w:t>
-      </w:r>
-      <w:r>
-        <w:t xml:space="preserve"> Designed automated data ingestion, semantic LLM parsing pipeline, and backend services on GCP with PostgreSQL. Successfully exited.</w:t>
+        <w:t xml:space="preserve">Architecture:</w:t>
+      </w:r>
+      <w:r>
+        <w:t xml:space="preserve"> Designed automated data ingestion, semantic LLM parsing pipeline, and backend services on GCP with PostgreSQL. Parted ways amicably with my co-founder in 2024.</w:t>
       </w:r>
     </w:p>
     <w:p>
@@ -1277,7 +1277,7 @@
         <w:keepNext/>
         <w:spacing w:after="70"/>
       </w:pPr>
-      <w:hyperlink w:history="1" r:id="rIdiiwhoyuxw5nphtz2s8yqv">
+      <w:hyperlink w:history="1" r:id="rIdb0ua5zxbc6_g9fzltym3l">
         <w:r>
           <w:rPr>
             <w:rStyle w:val="Hyperlink"/>

</xml_diff>